<commit_message>
docs: polish report images and trim unused assets
</commit_message>
<xml_diff>
--- a/final_report.docx
+++ b/final_report.docx
@@ -1236,8 +1236,61 @@
       <w:r>
         <w:drawing>
           <wp:inline xmlns:a="http://schemas.openxmlformats.org/drawingml/2006/main" xmlns:pic="http://schemas.openxmlformats.org/drawingml/2006/picture">
+            <wp:extent cx="5832000" cy="1581429"/>
+            <wp:docPr id="2" name="Picture 2"/>
+            <wp:cNvGraphicFramePr>
+              <a:graphicFrameLocks noChangeAspect="1"/>
+            </wp:cNvGraphicFramePr>
+            <a:graphic>
+              <a:graphicData uri="http://schemas.openxmlformats.org/drawingml/2006/picture">
+                <pic:pic>
+                  <pic:nvPicPr>
+                    <pic:cNvPr id="0" name="report-scene-collage.jpg"/>
+                    <pic:cNvPicPr/>
+                  </pic:nvPicPr>
+                  <pic:blipFill>
+                    <a:blip r:embed="rId10"/>
+                    <a:stretch>
+                      <a:fillRect/>
+                    </a:stretch>
+                  </pic:blipFill>
+                  <pic:spPr>
+                    <a:xfrm>
+                      <a:off x="0" y="0"/>
+                      <a:ext cx="5832000" cy="1581429"/>
+                    </a:xfrm>
+                    <a:prstGeom prst="rect"/>
+                  </pic:spPr>
+                </pic:pic>
+              </a:graphicData>
+            </a:graphic>
+          </wp:inline>
+        </w:drawing>
+      </w:r>
+    </w:p>
+    <w:p>
+      <w:pPr>
+        <w:spacing w:after="160"/>
+        <w:jc w:val="center"/>
+      </w:pPr>
+      <w:r>
+        <w:rPr>
+          <w:rFonts w:ascii="Microsoft YaHei" w:hAnsi="Microsoft YaHei" w:eastAsia="Microsoft YaHei"/>
+          <w:color w:val="785D48"/>
+          <w:sz w:val="18"/>
+        </w:rPr>
+        <w:t>上财公开现场照片：用于说明真实校园食堂场景，不作为菜品图替代</w:t>
+      </w:r>
+    </w:p>
+    <w:p>
+      <w:pPr>
+        <w:jc w:val="center"/>
+      </w:pPr>
+      <w:r>
+        <w:drawing>
+          <wp:inline xmlns:a="http://schemas.openxmlformats.org/drawingml/2006/main" xmlns:pic="http://schemas.openxmlformats.org/drawingml/2006/picture">
             <wp:extent cx="5832000" cy="4719672"/>
-            <wp:docPr id="2" name="Picture 2"/>
+            <wp:docPr id="3" name="Picture 3"/>
             <wp:cNvGraphicFramePr>
               <a:graphicFrameLocks noChangeAspect="1"/>
             </wp:cNvGraphicFramePr>
@@ -1249,7 +1302,7 @@
                     <pic:cNvPicPr/>
                   </pic:nvPicPr>
                   <pic:blipFill>
-                    <a:blip r:embed="rId10"/>
+                    <a:blip r:embed="rId11"/>
                     <a:stretch>
                       <a:fillRect/>
                     </a:stretch>

</xml_diff>